<commit_message>
Add practicals 1, 12, 13, 14 and an index to the combined doc
Co-Authored-By: Claude Opus 5.5 <noreply@anthropic.com>
Claude-Session: https://claude.ai/code/session_01AYFEYbcYCpdADP3kkazgB7
</commit_message>
<xml_diff>
--- a/STQA_All_Practicals.docx
+++ b/STQA_All_Practicals.docx
@@ -20,9 +20,410 @@
     </w:p>
     <w:p>
       <w:r>
-        <w:t>Practicals 2, 3, 4, 5, 6, 7, 8, 9, 10, 11, 15, 16</w:t>
+        <w:t>All Practicals 1 to 16</w:t>
       </w:r>
     </w:p>
+    <w:p>
+      <w:pPr>
+        <w:pStyle w:val="Heading1"/>
+      </w:pPr>
+      <w:r>
+        <w:t>Index</w:t>
+      </w:r>
+    </w:p>
+    <w:tbl>
+      <w:tblPr>
+        <w:tblStyle w:val="TableGrid"/>
+        <w:tblW w:type="auto" w:w="0"/>
+        <w:tblLayout w:type="fixed"/>
+        <w:tblLook w:firstColumn="1" w:firstRow="1" w:lastColumn="0" w:lastRow="0" w:noHBand="0" w:noVBand="1" w:val="04A0"/>
+      </w:tblPr>
+      <w:tblGrid>
+        <w:gridCol w:w="5100"/>
+        <w:gridCol w:w="5100"/>
+      </w:tblGrid>
+      <w:tr>
+        <w:tc>
+          <w:tcPr>
+            <w:tcW w:type="dxa" w:w="850"/>
+          </w:tcPr>
+          <w:p>
+            <w:r>
+              <w:rPr>
+                <w:b/>
+              </w:rPr>
+              <w:t>No.</w:t>
+            </w:r>
+          </w:p>
+        </w:tc>
+        <w:tc>
+          <w:tcPr>
+            <w:tcW w:type="dxa" w:w="9014"/>
+          </w:tcPr>
+          <w:p>
+            <w:r>
+              <w:rPr>
+                <w:b/>
+              </w:rPr>
+              <w:t>Practical</w:t>
+            </w:r>
+          </w:p>
+        </w:tc>
+      </w:tr>
+      <w:tr>
+        <w:tc>
+          <w:tcPr>
+            <w:tcW w:type="dxa" w:w="850"/>
+          </w:tcPr>
+          <w:p>
+            <w:r>
+              <w:t>1</w:t>
+            </w:r>
+          </w:p>
+        </w:tc>
+        <w:tc>
+          <w:tcPr>
+            <w:tcW w:type="dxa" w:w="9014"/>
+          </w:tcPr>
+          <w:p>
+            <w:r>
+              <w:t>Selenium IDE Test Suite (Arithmetic)</w:t>
+            </w:r>
+          </w:p>
+        </w:tc>
+      </w:tr>
+      <w:tr>
+        <w:tc>
+          <w:tcPr>
+            <w:tcW w:type="dxa" w:w="850"/>
+          </w:tcPr>
+          <w:p>
+            <w:r>
+              <w:t>2</w:t>
+            </w:r>
+          </w:p>
+        </w:tc>
+        <w:tc>
+          <w:tcPr>
+            <w:tcW w:type="dxa" w:w="9014"/>
+          </w:tcPr>
+          <w:p>
+            <w:r>
+              <w:t>Cross-Website Testing using Selenium IDE</w:t>
+            </w:r>
+          </w:p>
+        </w:tc>
+      </w:tr>
+      <w:tr>
+        <w:tc>
+          <w:tcPr>
+            <w:tcW w:type="dxa" w:w="850"/>
+          </w:tcPr>
+          <w:p>
+            <w:r>
+              <w:t>3</w:t>
+            </w:r>
+          </w:p>
+        </w:tc>
+        <w:tc>
+          <w:tcPr>
+            <w:tcW w:type="dxa" w:w="9014"/>
+          </w:tcPr>
+          <w:p>
+            <w:r>
+              <w:t>Manual Test Case Design (STLC)</w:t>
+            </w:r>
+          </w:p>
+        </w:tc>
+      </w:tr>
+      <w:tr>
+        <w:tc>
+          <w:tcPr>
+            <w:tcW w:type="dxa" w:w="850"/>
+          </w:tcPr>
+          <w:p>
+            <w:r>
+              <w:t>4</w:t>
+            </w:r>
+          </w:p>
+        </w:tc>
+        <w:tc>
+          <w:tcPr>
+            <w:tcW w:type="dxa" w:w="9014"/>
+          </w:tcPr>
+          <w:p>
+            <w:r>
+              <w:t>Selenium Grid - Cross-Browser Testing</w:t>
+            </w:r>
+          </w:p>
+        </w:tc>
+      </w:tr>
+      <w:tr>
+        <w:tc>
+          <w:tcPr>
+            <w:tcW w:type="dxa" w:w="850"/>
+          </w:tcPr>
+          <w:p>
+            <w:r>
+              <w:t>5</w:t>
+            </w:r>
+          </w:p>
+        </w:tc>
+        <w:tc>
+          <w:tcPr>
+            <w:tcW w:type="dxa" w:w="9014"/>
+          </w:tcPr>
+          <w:p>
+            <w:r>
+              <w:t>Login Automation with Assertions</w:t>
+            </w:r>
+          </w:p>
+        </w:tc>
+      </w:tr>
+      <w:tr>
+        <w:tc>
+          <w:tcPr>
+            <w:tcW w:type="dxa" w:w="850"/>
+          </w:tcPr>
+          <w:p>
+            <w:r>
+              <w:t>6</w:t>
+            </w:r>
+          </w:p>
+        </w:tc>
+        <w:tc>
+          <w:tcPr>
+            <w:tcW w:type="dxa" w:w="9014"/>
+          </w:tcPr>
+          <w:p>
+            <w:r>
+              <w:t>Web Elements, Waits &amp; Checkboxes</w:t>
+            </w:r>
+          </w:p>
+        </w:tc>
+      </w:tr>
+      <w:tr>
+        <w:tc>
+          <w:tcPr>
+            <w:tcW w:type="dxa" w:w="850"/>
+          </w:tcPr>
+          <w:p>
+            <w:r>
+              <w:t>7</w:t>
+            </w:r>
+          </w:p>
+        </w:tc>
+        <w:tc>
+          <w:tcPr>
+            <w:tcW w:type="dxa" w:w="9014"/>
+          </w:tcPr>
+          <w:p>
+            <w:r>
+              <w:t>Data-Driven Testing with Apache POI</w:t>
+            </w:r>
+          </w:p>
+        </w:tc>
+      </w:tr>
+      <w:tr>
+        <w:tc>
+          <w:tcPr>
+            <w:tcW w:type="dxa" w:w="850"/>
+          </w:tcPr>
+          <w:p>
+            <w:r>
+              <w:t>8</w:t>
+            </w:r>
+          </w:p>
+        </w:tc>
+        <w:tc>
+          <w:tcPr>
+            <w:tcW w:type="dxa" w:w="9014"/>
+          </w:tcPr>
+          <w:p>
+            <w:r>
+              <w:t>Web Table Extraction &amp; Sorting</w:t>
+            </w:r>
+          </w:p>
+        </w:tc>
+      </w:tr>
+      <w:tr>
+        <w:tc>
+          <w:tcPr>
+            <w:tcW w:type="dxa" w:w="850"/>
+          </w:tcPr>
+          <w:p>
+            <w:r>
+              <w:t>9</w:t>
+            </w:r>
+          </w:p>
+        </w:tc>
+        <w:tc>
+          <w:tcPr>
+            <w:tcW w:type="dxa" w:w="9014"/>
+          </w:tcPr>
+          <w:p>
+            <w:r>
+              <w:t>Object Counting &amp; Combo Box</w:t>
+            </w:r>
+          </w:p>
+        </w:tc>
+      </w:tr>
+      <w:tr>
+        <w:tc>
+          <w:tcPr>
+            <w:tcW w:type="dxa" w:w="850"/>
+          </w:tcPr>
+          <w:p>
+            <w:r>
+              <w:t>10</w:t>
+            </w:r>
+          </w:p>
+        </w:tc>
+        <w:tc>
+          <w:tcPr>
+            <w:tcW w:type="dxa" w:w="9014"/>
+          </w:tcPr>
+          <w:p>
+            <w:r>
+              <w:t>File Upload &amp; Download (Robot Class)</w:t>
+            </w:r>
+          </w:p>
+        </w:tc>
+      </w:tr>
+      <w:tr>
+        <w:tc>
+          <w:tcPr>
+            <w:tcW w:type="dxa" w:w="850"/>
+          </w:tcPr>
+          <w:p>
+            <w:r>
+              <w:t>11</w:t>
+            </w:r>
+          </w:p>
+        </w:tc>
+        <w:tc>
+          <w:tcPr>
+            <w:tcW w:type="dxa" w:w="9014"/>
+          </w:tcPr>
+          <w:p>
+            <w:r>
+              <w:t>Screenshot on Failure &amp; Log4j</w:t>
+            </w:r>
+          </w:p>
+        </w:tc>
+      </w:tr>
+      <w:tr>
+        <w:tc>
+          <w:tcPr>
+            <w:tcW w:type="dxa" w:w="850"/>
+          </w:tcPr>
+          <w:p>
+            <w:r>
+              <w:t>12</w:t>
+            </w:r>
+          </w:p>
+        </w:tc>
+        <w:tc>
+          <w:tcPr>
+            <w:tcW w:type="dxa" w:w="9014"/>
+          </w:tcPr>
+          <w:p>
+            <w:r>
+              <w:t>Page Object Model (POM) Framework</w:t>
+            </w:r>
+          </w:p>
+        </w:tc>
+      </w:tr>
+      <w:tr>
+        <w:tc>
+          <w:tcPr>
+            <w:tcW w:type="dxa" w:w="850"/>
+          </w:tcPr>
+          <w:p>
+            <w:r>
+              <w:t>13</w:t>
+            </w:r>
+          </w:p>
+        </w:tc>
+        <w:tc>
+          <w:tcPr>
+            <w:tcW w:type="dxa" w:w="9014"/>
+          </w:tcPr>
+          <w:p>
+            <w:r>
+              <w:t>TestNG Framework &amp; HTML Reports</w:t>
+            </w:r>
+          </w:p>
+        </w:tc>
+      </w:tr>
+      <w:tr>
+        <w:tc>
+          <w:tcPr>
+            <w:tcW w:type="dxa" w:w="850"/>
+          </w:tcPr>
+          <w:p>
+            <w:r>
+              <w:t>14</w:t>
+            </w:r>
+          </w:p>
+        </w:tc>
+        <w:tc>
+          <w:tcPr>
+            <w:tcW w:type="dxa" w:w="9014"/>
+          </w:tcPr>
+          <w:p>
+            <w:r>
+              <w:t>Jenkins CI for Selenium Tests</w:t>
+            </w:r>
+          </w:p>
+        </w:tc>
+      </w:tr>
+      <w:tr>
+        <w:tc>
+          <w:tcPr>
+            <w:tcW w:type="dxa" w:w="850"/>
+          </w:tcPr>
+          <w:p>
+            <w:r>
+              <w:t>15</w:t>
+            </w:r>
+          </w:p>
+        </w:tc>
+        <w:tc>
+          <w:tcPr>
+            <w:tcW w:type="dxa" w:w="9014"/>
+          </w:tcPr>
+          <w:p>
+            <w:r>
+              <w:t>Load Testing with JMeter</w:t>
+            </w:r>
+          </w:p>
+        </w:tc>
+      </w:tr>
+      <w:tr>
+        <w:tc>
+          <w:tcPr>
+            <w:tcW w:type="dxa" w:w="850"/>
+          </w:tcPr>
+          <w:p>
+            <w:r>
+              <w:t>16</w:t>
+            </w:r>
+          </w:p>
+        </w:tc>
+        <w:tc>
+          <w:tcPr>
+            <w:tcW w:type="dxa" w:w="9014"/>
+          </w:tcPr>
+          <w:p>
+            <w:r>
+              <w:t>Defect Tracking with Bugzilla</w:t>
+            </w:r>
+          </w:p>
+        </w:tc>
+      </w:tr>
+    </w:tbl>
+    <w:p/>
     <w:p>
       <w:pPr>
         <w:pStyle w:val="Heading1"/>
@@ -60,7 +461,7 @@
         <w:pStyle w:val="ListNumber"/>
       </w:pPr>
       <w:r>
-        <w:t>Create one package per practical (p4, p5, p6 ...) and paste the class. The class name must match the file name (P5.java etc.).</w:t>
+        <w:t>Create one package per practical (p4, p5, p6 ...; Practical 12 uses packages pages and tests) and paste the class. The class name must match the file name (P5.java etc.).</w:t>
       </w:r>
     </w:p>
     <w:p>
@@ -71,6 +472,296 @@
         <w:t>Run: right-click the file &gt; Run As &gt; Java Application. Created files (Excel, HTML, logs, screenshots, downloads) appear in the project folder; press F5 on the project to see them.</w:t>
       </w:r>
     </w:p>
+    <w:p>
+      <w:r>
+        <w:br w:type="page"/>
+      </w:r>
+    </w:p>
+    <w:p>
+      <w:pPr>
+        <w:pStyle w:val="Heading1"/>
+      </w:pPr>
+      <w:r>
+        <w:t>Practical 1: Selenium IDE Test Suite (Arithmetic Operations)</w:t>
+      </w:r>
+    </w:p>
+    <w:p>
+      <w:pPr>
+        <w:spacing w:after="40"/>
+      </w:pPr>
+      <w:r>
+        <w:rPr>
+          <w:b/>
+          <w:color w:val="1F4E79"/>
+        </w:rPr>
+        <w:t>Aim:</w:t>
+      </w:r>
+      <w:r>
+        <w:t xml:space="preserve"> Install Selenium IDE, create a test suite with 4 test cases (Addition, Subtraction, Multiplication, Division), run it and export the script in WebDriver format.</w:t>
+      </w:r>
+    </w:p>
+    <w:p>
+      <w:pPr>
+        <w:spacing w:after="40"/>
+      </w:pPr>
+      <w:r>
+        <w:rPr>
+          <w:b/>
+          <w:color w:val="1F4E79"/>
+        </w:rPr>
+        <w:t>Requirements:</w:t>
+      </w:r>
+      <w:r>
+        <w:t xml:space="preserve"> Chrome + Selenium IDE extension, NetBeans with GlassFish (or just a saved HTML file).</w:t>
+      </w:r>
+    </w:p>
+    <w:p>
+      <w:pPr>
+        <w:spacing w:after="40"/>
+      </w:pPr>
+      <w:r>
+        <w:rPr>
+          <w:b/>
+          <w:color w:val="1F4E79"/>
+        </w:rPr>
+        <w:t>Step 1: Install Selenium IDE</w:t>
+      </w:r>
+    </w:p>
+    <w:p>
+      <w:r>
+        <w:t>Chrome Web Store &gt; search "Selenium IDE" &gt; Add to Chrome &gt; Add Extension. Its icon appears in the toolbar.</w:t>
+      </w:r>
+    </w:p>
+    <w:p>
+      <w:pPr>
+        <w:spacing w:after="40"/>
+      </w:pPr>
+      <w:r>
+        <w:rPr>
+          <w:b/>
+          <w:color w:val="1F4E79"/>
+        </w:rPr>
+        <w:t>Step 2: Create the web page (index.html)</w:t>
+      </w:r>
+    </w:p>
+    <w:p>
+      <w:r>
+        <w:t>NetBeans &gt; File &gt; New Project &gt; Java Web &gt; Web Application &gt; name it &gt; GlassFish Server &gt; Finish. Replace index.html with the code below and click Run. Copy the localhost URL.</w:t>
+      </w:r>
+    </w:p>
+    <w:tbl>
+      <w:tblPr>
+        <w:tblStyle w:val="TableGrid"/>
+        <w:tblW w:type="auto" w:w="0"/>
+        <w:tblLook w:firstColumn="1" w:firstRow="1" w:lastColumn="0" w:lastRow="0" w:noHBand="0" w:noVBand="1" w:val="04A0"/>
+      </w:tblPr>
+      <w:tblGrid>
+        <w:gridCol w:w="10200"/>
+      </w:tblGrid>
+      <w:tr>
+        <w:tc>
+          <w:tcPr>
+            <w:tcW w:type="dxa" w:w="10200"/>
+            <w:shd w:fill="F2F2F2"/>
+          </w:tcPr>
+          <w:p>
+            <w:pPr>
+              <w:spacing w:after="0"/>
+            </w:pPr>
+            <w:r>
+              <w:rPr>
+                <w:rFonts w:ascii="Consolas" w:hAnsi="Consolas" w:eastAsia="Consolas"/>
+                <w:sz w:val="18"/>
+              </w:rPr>
+              <w:t>&lt;!DOCTYPE html&gt;</w:t>
+              <w:br/>
+              <w:t>&lt;html&gt;</w:t>
+              <w:br/>
+              <w:t>&lt;head&gt;&lt;title&gt;Arithmetic Operations&lt;/title&gt;</w:t>
+              <w:br/>
+              <w:t>&lt;script&gt;</w:t>
+              <w:br/>
+              <w:t>function calc(op) {</w:t>
+              <w:br/>
+              <w:t xml:space="preserve">  var a = parseInt(document.f.n1.value), b = parseInt(document.f.n2.value);</w:t>
+              <w:br/>
+              <w:t xml:space="preserve">  document.f.res.value = op == '+' ? a + b : op == '-' ? a - b : op == '*' ? a * b : a / b;</w:t>
+              <w:br/>
+              <w:t>}</w:t>
+              <w:br/>
+              <w:t>&lt;/script&gt;</w:t>
+              <w:br/>
+              <w:t>&lt;/head&gt;</w:t>
+              <w:br/>
+              <w:t>&lt;body&gt;</w:t>
+              <w:br/>
+              <w:t>&lt;h2&gt;Arithmetic Operations&lt;/h2&gt;</w:t>
+              <w:br/>
+              <w:t>&lt;form name="f"&gt;</w:t>
+              <w:br/>
+              <w:t xml:space="preserve">  Number 1: &lt;input type="text" id="n1" name="n1"&gt;&lt;br&gt;&lt;br&gt;</w:t>
+              <w:br/>
+              <w:t xml:space="preserve">  Number 2: &lt;input type="text" id="n2" name="n2"&gt;&lt;br&gt;&lt;br&gt;</w:t>
+              <w:br/>
+              <w:t xml:space="preserve">  Result  : &lt;input type="text" id="res" name="res"&gt;&lt;br&gt;&lt;br&gt;</w:t>
+              <w:br/>
+              <w:t xml:space="preserve">  &lt;input type="button" value="Add"      onclick="calc('+')"&gt;</w:t>
+              <w:br/>
+              <w:t xml:space="preserve">  &lt;input type="button" value="Subtract" onclick="calc('-')"&gt;</w:t>
+              <w:br/>
+              <w:t xml:space="preserve">  &lt;input type="button" value="Multiply" onclick="calc('*')"&gt;</w:t>
+              <w:br/>
+              <w:t xml:space="preserve">  &lt;input type="button" value="Divide"   onclick="calc('/')"&gt;</w:t>
+              <w:br/>
+              <w:t>&lt;/form&gt;</w:t>
+              <w:br/>
+              <w:t>&lt;/body&gt;</w:t>
+              <w:br/>
+              <w:t>&lt;/html&gt;</w:t>
+            </w:r>
+          </w:p>
+        </w:tc>
+      </w:tr>
+    </w:tbl>
+    <w:p/>
+    <w:p>
+      <w:pPr>
+        <w:spacing w:after="40"/>
+      </w:pPr>
+      <w:r>
+        <w:rPr>
+          <w:b/>
+          <w:color w:val="1F4E79"/>
+        </w:rPr>
+        <w:t>No NetBeans?</w:t>
+      </w:r>
+      <w:r>
+        <w:t xml:space="preserve"> Save the code as C:\STQA\index.html and open it in Chrome (URL: file:///C:/STQA/index.html). Then go to chrome://extensions &gt; Selenium IDE &gt; Details and turn on "Allow access to file URLs".</w:t>
+      </w:r>
+    </w:p>
+    <w:p>
+      <w:pPr>
+        <w:spacing w:after="40"/>
+      </w:pPr>
+      <w:r>
+        <w:rPr>
+          <w:b/>
+          <w:color w:val="1F4E79"/>
+        </w:rPr>
+        <w:t>Step 3: Record 4 test cases</w:t>
+      </w:r>
+    </w:p>
+    <w:p>
+      <w:pPr>
+        <w:pStyle w:val="ListNumber"/>
+      </w:pPr>
+      <w:r>
+        <w:t>Open Selenium IDE &gt; Record a new test in a new project &gt; project name: ArithmeticSuite &gt; paste the page URL &gt; Start Recording.</w:t>
+      </w:r>
+    </w:p>
+    <w:p>
+      <w:pPr>
+        <w:pStyle w:val="ListNumber"/>
+      </w:pPr>
+      <w:r>
+        <w:t>Addition: type 20 in Number 1 and 10 in Number 2, click Add. Right-click the Result box &gt; Selenium IDE &gt; Assert &gt; Value (30). Stop recording, name the test Addition.</w:t>
+      </w:r>
+    </w:p>
+    <w:p>
+      <w:pPr>
+        <w:pStyle w:val="ListNumber"/>
+      </w:pPr>
+      <w:r>
+        <w:t>Click + (Add new test) and record the same way: Subtraction (20, 10 = 10), Multiplication (20, 10 = 200), Division (20, 10 = 2).</w:t>
+      </w:r>
+    </w:p>
+    <w:p>
+      <w:pPr>
+        <w:pStyle w:val="ListNumber"/>
+      </w:pPr>
+      <w:r>
+        <w:t>Test Suites tab &gt; + &gt; name ArithmeticSuite &gt; Add tests &gt; tick all 4 tests.</w:t>
+      </w:r>
+    </w:p>
+    <w:p>
+      <w:pPr>
+        <w:spacing w:after="40"/>
+      </w:pPr>
+      <w:r>
+        <w:rPr>
+          <w:b/>
+          <w:color w:val="1F4E79"/>
+        </w:rPr>
+        <w:t>Step 4: Run and Export</w:t>
+      </w:r>
+    </w:p>
+    <w:p>
+      <w:pPr>
+        <w:pStyle w:val="ListNumber"/>
+      </w:pPr>
+      <w:r>
+        <w:t>Click Run all tests in suite. All 4 tests pass (green).</w:t>
+      </w:r>
+    </w:p>
+    <w:p>
+      <w:pPr>
+        <w:pStyle w:val="ListNumber"/>
+      </w:pPr>
+      <w:r>
+        <w:t>Right-click each test (or the suite) &gt; Export &gt; Java JUnit &gt; Export. This saves a .java file with WebDriver code (driver.findElement, sendKeys, click, assertEquals).</w:t>
+      </w:r>
+    </w:p>
+    <w:p>
+      <w:pPr>
+        <w:spacing w:after="40"/>
+      </w:pPr>
+      <w:r>
+        <w:rPr>
+          <w:b/>
+          <w:color w:val="1F4E79"/>
+        </w:rPr>
+        <w:t>Expected Output:</w:t>
+      </w:r>
+    </w:p>
+    <w:tbl>
+      <w:tblPr>
+        <w:tblStyle w:val="TableGrid"/>
+        <w:tblW w:type="auto" w:w="0"/>
+        <w:tblLook w:firstColumn="1" w:firstRow="1" w:lastColumn="0" w:lastRow="0" w:noHBand="0" w:noVBand="1" w:val="04A0"/>
+      </w:tblPr>
+      <w:tblGrid>
+        <w:gridCol w:w="10200"/>
+      </w:tblGrid>
+      <w:tr>
+        <w:tc>
+          <w:tcPr>
+            <w:tcW w:type="dxa" w:w="10200"/>
+            <w:shd w:fill="F2F2F2"/>
+          </w:tcPr>
+          <w:p>
+            <w:pPr>
+              <w:spacing w:after="0"/>
+            </w:pPr>
+            <w:r>
+              <w:rPr>
+                <w:rFonts w:ascii="Consolas" w:hAnsi="Consolas" w:eastAsia="Consolas"/>
+                <w:sz w:val="18"/>
+              </w:rPr>
+              <w:t>Running 'Addition'       ... assertValue id=res 30  OK</w:t>
+              <w:br/>
+              <w:t>Running 'Subtraction'    ... assertValue id=res 10  OK</w:t>
+              <w:br/>
+              <w:t>Running 'Multiplication' ... assertValue id=res 200 OK</w:t>
+              <w:br/>
+              <w:t>Running 'Division'       ... assertValue id=res 2   OK</w:t>
+              <w:br/>
+              <w:t>ArithmeticSuite: 4 of 4 tests passed</w:t>
+            </w:r>
+          </w:p>
+        </w:tc>
+      </w:tr>
+    </w:tbl>
+    <w:p/>
     <w:p>
       <w:r>
         <w:br w:type="page"/>
@@ -3027,6 +3718,1093 @@
       </w:r>
       <w:r>
         <w:t xml:space="preserve"> The ERROR line shows which check failed and why (expected /secure, got /login). The screenshot shows the page when the test failed.</w:t>
+      </w:r>
+    </w:p>
+    <w:p>
+      <w:r>
+        <w:br w:type="page"/>
+      </w:r>
+    </w:p>
+    <w:p>
+      <w:pPr>
+        <w:pStyle w:val="Heading1"/>
+      </w:pPr>
+      <w:r>
+        <w:t>Practical 12: Page Object Model (POM) Framework</w:t>
+      </w:r>
+    </w:p>
+    <w:p>
+      <w:pPr>
+        <w:spacing w:after="40"/>
+      </w:pPr>
+      <w:r>
+        <w:rPr>
+          <w:b/>
+          <w:color w:val="1F4E79"/>
+        </w:rPr>
+        <w:t>Aim:</w:t>
+      </w:r>
+      <w:r>
+        <w:t xml:space="preserve"> Design an automation framework using the Page Object Model. Create reusable page classes and run modular test cases.</w:t>
+      </w:r>
+    </w:p>
+    <w:p>
+      <w:pPr>
+        <w:spacing w:after="40"/>
+      </w:pPr>
+      <w:r>
+        <w:rPr>
+          <w:b/>
+          <w:color w:val="1F4E79"/>
+        </w:rPr>
+        <w:t>Requirements:</w:t>
+      </w:r>
+      <w:r>
+        <w:t xml:space="preserve"> Selenium JARs + TestNG (Eclipse: Help &gt; Eclipse Marketplace &gt; TestNG &gt; Install. Then right-click Project &gt; Build Path &gt; Add Libraries &gt; TestNG).</w:t>
+      </w:r>
+    </w:p>
+    <w:p>
+      <w:pPr>
+        <w:spacing w:after="40"/>
+      </w:pPr>
+      <w:r>
+        <w:rPr>
+          <w:b/>
+          <w:color w:val="1F4E79"/>
+        </w:rPr>
+        <w:t>Project Structure:</w:t>
+      </w:r>
+    </w:p>
+    <w:tbl>
+      <w:tblPr>
+        <w:tblStyle w:val="TableGrid"/>
+        <w:tblW w:type="auto" w:w="0"/>
+        <w:tblLook w:firstColumn="1" w:firstRow="1" w:lastColumn="0" w:lastRow="0" w:noHBand="0" w:noVBand="1" w:val="04A0"/>
+      </w:tblPr>
+      <w:tblGrid>
+        <w:gridCol w:w="10200"/>
+      </w:tblGrid>
+      <w:tr>
+        <w:tc>
+          <w:tcPr>
+            <w:tcW w:type="dxa" w:w="10200"/>
+            <w:shd w:fill="F2F2F2"/>
+          </w:tcPr>
+          <w:p>
+            <w:pPr>
+              <w:spacing w:after="0"/>
+            </w:pPr>
+            <w:r>
+              <w:rPr>
+                <w:rFonts w:ascii="Consolas" w:hAnsi="Consolas" w:eastAsia="Consolas"/>
+                <w:sz w:val="18"/>
+              </w:rPr>
+              <w:t>src</w:t>
+              <w:br/>
+              <w:t xml:space="preserve"> |-- pages</w:t>
+              <w:br/>
+              <w:t xml:space="preserve"> |    |-- LoginPage.java    (locators + actions of login page)</w:t>
+              <w:br/>
+              <w:t xml:space="preserve"> |    |-- SecurePage.java   (locators + actions of secure page)</w:t>
+              <w:br/>
+              <w:t xml:space="preserve"> |-- tests</w:t>
+              <w:br/>
+              <w:t xml:space="preserve">      |-- LoginPOMTest.java (test cases - no locators here)</w:t>
+            </w:r>
+          </w:p>
+        </w:tc>
+      </w:tr>
+    </w:tbl>
+    <w:p/>
+    <w:p>
+      <w:pPr>
+        <w:spacing w:after="40"/>
+      </w:pPr>
+      <w:r>
+        <w:rPr>
+          <w:b/>
+          <w:color w:val="1F4E79"/>
+        </w:rPr>
+        <w:t>pages &gt; LoginPage.java:</w:t>
+      </w:r>
+    </w:p>
+    <w:tbl>
+      <w:tblPr>
+        <w:tblStyle w:val="TableGrid"/>
+        <w:tblW w:type="auto" w:w="0"/>
+        <w:tblLook w:firstColumn="1" w:firstRow="1" w:lastColumn="0" w:lastRow="0" w:noHBand="0" w:noVBand="1" w:val="04A0"/>
+      </w:tblPr>
+      <w:tblGrid>
+        <w:gridCol w:w="10200"/>
+      </w:tblGrid>
+      <w:tr>
+        <w:tc>
+          <w:tcPr>
+            <w:tcW w:type="dxa" w:w="10200"/>
+            <w:shd w:fill="F2F2F2"/>
+          </w:tcPr>
+          <w:p>
+            <w:pPr>
+              <w:spacing w:after="0"/>
+            </w:pPr>
+            <w:r>
+              <w:rPr>
+                <w:rFonts w:ascii="Consolas" w:hAnsi="Consolas" w:eastAsia="Consolas"/>
+                <w:sz w:val="18"/>
+              </w:rPr>
+              <w:t>package pages;</w:t>
+              <w:br/>
+              <w:br/>
+              <w:t>import org.openqa.selenium.*;</w:t>
+              <w:br/>
+              <w:br/>
+              <w:t>public class LoginPage {</w:t>
+              <w:br/>
+              <w:t xml:space="preserve">    WebDriver d;</w:t>
+              <w:br/>
+              <w:t xml:space="preserve">    By user = By.id("username");</w:t>
+              <w:br/>
+              <w:t xml:space="preserve">    By pass = By.id("password");</w:t>
+              <w:br/>
+              <w:t xml:space="preserve">    By loginBtn = By.cssSelector("button[type='submit']");</w:t>
+              <w:br/>
+              <w:t xml:space="preserve">    By msg = By.id("flash");</w:t>
+              <w:br/>
+              <w:br/>
+              <w:t xml:space="preserve">    public LoginPage(WebDriver d) { this.d = d; }</w:t>
+              <w:br/>
+              <w:br/>
+              <w:t xml:space="preserve">    public void open() { d.get("https://the-internet.herokuapp.com/login"); }</w:t>
+              <w:br/>
+              <w:br/>
+              <w:t xml:space="preserve">    public void login(String u, String p) {</w:t>
+              <w:br/>
+              <w:t xml:space="preserve">        d.findElement(user).sendKeys(u);</w:t>
+              <w:br/>
+              <w:t xml:space="preserve">        d.findElement(pass).sendKeys(p);</w:t>
+              <w:br/>
+              <w:t xml:space="preserve">        d.findElement(loginBtn).click();</w:t>
+              <w:br/>
+              <w:t xml:space="preserve">    }</w:t>
+              <w:br/>
+              <w:br/>
+              <w:t xml:space="preserve">    public String getMessage() { return d.findElement(msg).getText(); }</w:t>
+              <w:br/>
+              <w:t>}</w:t>
+            </w:r>
+          </w:p>
+        </w:tc>
+      </w:tr>
+    </w:tbl>
+    <w:p/>
+    <w:p>
+      <w:pPr>
+        <w:spacing w:after="40"/>
+      </w:pPr>
+      <w:r>
+        <w:rPr>
+          <w:b/>
+          <w:color w:val="1F4E79"/>
+        </w:rPr>
+        <w:t>pages &gt; SecurePage.java:</w:t>
+      </w:r>
+    </w:p>
+    <w:tbl>
+      <w:tblPr>
+        <w:tblStyle w:val="TableGrid"/>
+        <w:tblW w:type="auto" w:w="0"/>
+        <w:tblLook w:firstColumn="1" w:firstRow="1" w:lastColumn="0" w:lastRow="0" w:noHBand="0" w:noVBand="1" w:val="04A0"/>
+      </w:tblPr>
+      <w:tblGrid>
+        <w:gridCol w:w="10200"/>
+      </w:tblGrid>
+      <w:tr>
+        <w:tc>
+          <w:tcPr>
+            <w:tcW w:type="dxa" w:w="10200"/>
+            <w:shd w:fill="F2F2F2"/>
+          </w:tcPr>
+          <w:p>
+            <w:pPr>
+              <w:spacing w:after="0"/>
+            </w:pPr>
+            <w:r>
+              <w:rPr>
+                <w:rFonts w:ascii="Consolas" w:hAnsi="Consolas" w:eastAsia="Consolas"/>
+                <w:sz w:val="18"/>
+              </w:rPr>
+              <w:t>package pages;</w:t>
+              <w:br/>
+              <w:br/>
+              <w:t>import org.openqa.selenium.*;</w:t>
+              <w:br/>
+              <w:br/>
+              <w:t>public class SecurePage {</w:t>
+              <w:br/>
+              <w:t xml:space="preserve">    WebDriver d;</w:t>
+              <w:br/>
+              <w:t xml:space="preserve">    By logout = By.cssSelector("a[href='/logout']");</w:t>
+              <w:br/>
+              <w:br/>
+              <w:t xml:space="preserve">    public SecurePage(WebDriver d) { this.d = d; }</w:t>
+              <w:br/>
+              <w:br/>
+              <w:t xml:space="preserve">    public boolean isLogoutVisible() { return d.findElement(logout).isDisplayed(); }</w:t>
+              <w:br/>
+              <w:br/>
+              <w:t xml:space="preserve">    public void clickLogout() { d.findElement(logout).click(); }</w:t>
+              <w:br/>
+              <w:t>}</w:t>
+            </w:r>
+          </w:p>
+        </w:tc>
+      </w:tr>
+    </w:tbl>
+    <w:p/>
+    <w:p>
+      <w:pPr>
+        <w:spacing w:after="40"/>
+      </w:pPr>
+      <w:r>
+        <w:rPr>
+          <w:b/>
+          <w:color w:val="1F4E79"/>
+        </w:rPr>
+        <w:t>tests &gt; LoginPOMTest.java:</w:t>
+      </w:r>
+    </w:p>
+    <w:tbl>
+      <w:tblPr>
+        <w:tblStyle w:val="TableGrid"/>
+        <w:tblW w:type="auto" w:w="0"/>
+        <w:tblLook w:firstColumn="1" w:firstRow="1" w:lastColumn="0" w:lastRow="0" w:noHBand="0" w:noVBand="1" w:val="04A0"/>
+      </w:tblPr>
+      <w:tblGrid>
+        <w:gridCol w:w="10200"/>
+      </w:tblGrid>
+      <w:tr>
+        <w:tc>
+          <w:tcPr>
+            <w:tcW w:type="dxa" w:w="10200"/>
+            <w:shd w:fill="F2F2F2"/>
+          </w:tcPr>
+          <w:p>
+            <w:pPr>
+              <w:spacing w:after="0"/>
+            </w:pPr>
+            <w:r>
+              <w:rPr>
+                <w:rFonts w:ascii="Consolas" w:hAnsi="Consolas" w:eastAsia="Consolas"/>
+                <w:sz w:val="18"/>
+              </w:rPr>
+              <w:t>package tests;</w:t>
+              <w:br/>
+              <w:br/>
+              <w:t>import org.openqa.selenium.WebDriver;</w:t>
+              <w:br/>
+              <w:t>import org.openqa.selenium.chrome.ChromeDriver;</w:t>
+              <w:br/>
+              <w:t>import org.testng.Assert;</w:t>
+              <w:br/>
+              <w:t>import org.testng.annotations.*;</w:t>
+              <w:br/>
+              <w:t>import pages.*;</w:t>
+              <w:br/>
+              <w:br/>
+              <w:t>public class LoginPOMTest {</w:t>
+              <w:br/>
+              <w:t xml:space="preserve">    WebDriver d;</w:t>
+              <w:br/>
+              <w:t xml:space="preserve">    LoginPage login;</w:t>
+              <w:br/>
+              <w:t xml:space="preserve">    SecurePage secure;</w:t>
+              <w:br/>
+              <w:br/>
+              <w:t xml:space="preserve">    @BeforeMethod</w:t>
+              <w:br/>
+              <w:t xml:space="preserve">    public void setUp() {</w:t>
+              <w:br/>
+              <w:t xml:space="preserve">        d = new ChromeDriver();</w:t>
+              <w:br/>
+              <w:t xml:space="preserve">        login = new LoginPage(d);</w:t>
+              <w:br/>
+              <w:t xml:space="preserve">        secure = new SecurePage(d);</w:t>
+              <w:br/>
+              <w:t xml:space="preserve">    }</w:t>
+              <w:br/>
+              <w:br/>
+              <w:t xml:space="preserve">    @Test</w:t>
+              <w:br/>
+              <w:t xml:space="preserve">    public void validLoginTest() {</w:t>
+              <w:br/>
+              <w:t xml:space="preserve">        login.open();</w:t>
+              <w:br/>
+              <w:t xml:space="preserve">        login.login("tomsmith", "SuperSecretPassword!");</w:t>
+              <w:br/>
+              <w:t xml:space="preserve">        Assert.assertTrue(d.getCurrentUrl().contains("/secure"));</w:t>
+              <w:br/>
+              <w:t xml:space="preserve">        Assert.assertTrue(secure.isLogoutVisible());</w:t>
+              <w:br/>
+              <w:t xml:space="preserve">    }</w:t>
+              <w:br/>
+              <w:br/>
+              <w:t xml:space="preserve">    @Test</w:t>
+              <w:br/>
+              <w:t xml:space="preserve">    public void invalidLoginTest() {</w:t>
+              <w:br/>
+              <w:t xml:space="preserve">        login.open();</w:t>
+              <w:br/>
+              <w:t xml:space="preserve">        login.login("wronguser", "wrongpass");</w:t>
+              <w:br/>
+              <w:t xml:space="preserve">        Assert.assertTrue(login.getMessage().contains("Your username is invalid!"));</w:t>
+              <w:br/>
+              <w:t xml:space="preserve">    }</w:t>
+              <w:br/>
+              <w:br/>
+              <w:t xml:space="preserve">    @AfterMethod</w:t>
+              <w:br/>
+              <w:t xml:space="preserve">    public void tearDown() { d.quit(); }</w:t>
+              <w:br/>
+              <w:t>}</w:t>
+            </w:r>
+          </w:p>
+        </w:tc>
+      </w:tr>
+    </w:tbl>
+    <w:p/>
+    <w:p>
+      <w:pPr>
+        <w:spacing w:after="40"/>
+      </w:pPr>
+      <w:r>
+        <w:rPr>
+          <w:b/>
+          <w:color w:val="1F4E79"/>
+        </w:rPr>
+        <w:t>Run:</w:t>
+      </w:r>
+      <w:r>
+        <w:t xml:space="preserve"> Right-click LoginPOMTest.java &gt; Run As &gt; TestNG Test.</w:t>
+      </w:r>
+    </w:p>
+    <w:p>
+      <w:pPr>
+        <w:spacing w:after="40"/>
+      </w:pPr>
+      <w:r>
+        <w:rPr>
+          <w:b/>
+          <w:color w:val="1F4E79"/>
+        </w:rPr>
+        <w:t>Expected Output:</w:t>
+      </w:r>
+    </w:p>
+    <w:tbl>
+      <w:tblPr>
+        <w:tblStyle w:val="TableGrid"/>
+        <w:tblW w:type="auto" w:w="0"/>
+        <w:tblLook w:firstColumn="1" w:firstRow="1" w:lastColumn="0" w:lastRow="0" w:noHBand="0" w:noVBand="1" w:val="04A0"/>
+      </w:tblPr>
+      <w:tblGrid>
+        <w:gridCol w:w="10200"/>
+      </w:tblGrid>
+      <w:tr>
+        <w:tc>
+          <w:tcPr>
+            <w:tcW w:type="dxa" w:w="10200"/>
+            <w:shd w:fill="F2F2F2"/>
+          </w:tcPr>
+          <w:p>
+            <w:pPr>
+              <w:spacing w:after="0"/>
+            </w:pPr>
+            <w:r>
+              <w:rPr>
+                <w:rFonts w:ascii="Consolas" w:hAnsi="Consolas" w:eastAsia="Consolas"/>
+                <w:sz w:val="18"/>
+              </w:rPr>
+              <w:t>PASSED: validLoginTest</w:t>
+              <w:br/>
+              <w:t>PASSED: invalidLoginTest</w:t>
+              <w:br/>
+              <w:t>Total tests run: 2, Passes: 2, Failures: 0, Skips: 0</w:t>
+            </w:r>
+          </w:p>
+        </w:tc>
+      </w:tr>
+    </w:tbl>
+    <w:p/>
+    <w:p>
+      <w:pPr>
+        <w:spacing w:after="40"/>
+      </w:pPr>
+      <w:r>
+        <w:rPr>
+          <w:b/>
+          <w:color w:val="1F4E79"/>
+        </w:rPr>
+        <w:t>Result:</w:t>
+      </w:r>
+      <w:r>
+        <w:t xml:space="preserve"> The test class has no locators, because they are all in the page classes. If a locator changes, you only edit the page class and the tests stay the same.</w:t>
+      </w:r>
+    </w:p>
+    <w:p>
+      <w:r>
+        <w:br w:type="page"/>
+      </w:r>
+    </w:p>
+    <w:p>
+      <w:pPr>
+        <w:pStyle w:val="Heading1"/>
+      </w:pPr>
+      <w:r>
+        <w:t>Practical 13: TestNG Framework &amp; HTML Reports</w:t>
+      </w:r>
+    </w:p>
+    <w:p>
+      <w:pPr>
+        <w:spacing w:after="40"/>
+      </w:pPr>
+      <w:r>
+        <w:rPr>
+          <w:b/>
+          <w:color w:val="1F4E79"/>
+        </w:rPr>
+        <w:t>Aim:</w:t>
+      </w:r>
+      <w:r>
+        <w:t xml:space="preserve"> Create and run automated tests using TestNG annotations. Group test cases, set priorities and generate HTML test reports.</w:t>
+      </w:r>
+    </w:p>
+    <w:p>
+      <w:pPr>
+        <w:spacing w:after="40"/>
+      </w:pPr>
+      <w:r>
+        <w:rPr>
+          <w:b/>
+          <w:color w:val="1F4E79"/>
+        </w:rPr>
+        <w:t>Requirements:</w:t>
+      </w:r>
+      <w:r>
+        <w:t xml:space="preserve"> Selenium JARs + TestNG library (same as Practical 12).</w:t>
+      </w:r>
+    </w:p>
+    <w:p>
+      <w:pPr>
+        <w:spacing w:after="40"/>
+      </w:pPr>
+      <w:r>
+        <w:rPr>
+          <w:b/>
+          <w:color w:val="1F4E79"/>
+        </w:rPr>
+        <w:t>Step 1: Code (p13 &gt; TestNGDemo.java):</w:t>
+      </w:r>
+    </w:p>
+    <w:tbl>
+      <w:tblPr>
+        <w:tblStyle w:val="TableGrid"/>
+        <w:tblW w:type="auto" w:w="0"/>
+        <w:tblLook w:firstColumn="1" w:firstRow="1" w:lastColumn="0" w:lastRow="0" w:noHBand="0" w:noVBand="1" w:val="04A0"/>
+      </w:tblPr>
+      <w:tblGrid>
+        <w:gridCol w:w="10200"/>
+      </w:tblGrid>
+      <w:tr>
+        <w:tc>
+          <w:tcPr>
+            <w:tcW w:type="dxa" w:w="10200"/>
+            <w:shd w:fill="F2F2F2"/>
+          </w:tcPr>
+          <w:p>
+            <w:pPr>
+              <w:spacing w:after="0"/>
+            </w:pPr>
+            <w:r>
+              <w:rPr>
+                <w:rFonts w:ascii="Consolas" w:hAnsi="Consolas" w:eastAsia="Consolas"/>
+                <w:sz w:val="18"/>
+              </w:rPr>
+              <w:t>package p13;</w:t>
+              <w:br/>
+              <w:br/>
+              <w:t>import org.openqa.selenium.*;</w:t>
+              <w:br/>
+              <w:t>import org.openqa.selenium.chrome.ChromeDriver;</w:t>
+              <w:br/>
+              <w:t>import org.testng.Assert;</w:t>
+              <w:br/>
+              <w:t>import org.testng.annotations.*;</w:t>
+              <w:br/>
+              <w:br/>
+              <w:t>public class TestNGDemo {</w:t>
+              <w:br/>
+              <w:t xml:space="preserve">    WebDriver d;</w:t>
+              <w:br/>
+              <w:br/>
+              <w:t xml:space="preserve">    @BeforeClass(alwaysRun = true)     // alwaysRun needed when running groups</w:t>
+              <w:br/>
+              <w:t xml:space="preserve">    public void setUp() { d = new ChromeDriver(); }</w:t>
+              <w:br/>
+              <w:br/>
+              <w:t xml:space="preserve">    @Test(priority = 1, groups = {"smoke"})</w:t>
+              <w:br/>
+              <w:t xml:space="preserve">    public void openLoginPage() {</w:t>
+              <w:br/>
+              <w:t xml:space="preserve">        d.get("https://the-internet.herokuapp.com/login");</w:t>
+              <w:br/>
+              <w:t xml:space="preserve">        Assert.assertEquals(d.getTitle(), "The Internet");</w:t>
+              <w:br/>
+              <w:t xml:space="preserve">    }</w:t>
+              <w:br/>
+              <w:br/>
+              <w:t xml:space="preserve">    @Test(priority = 2, groups = {"smoke", "regression"})</w:t>
+              <w:br/>
+              <w:t xml:space="preserve">    public void validLogin() {</w:t>
+              <w:br/>
+              <w:t xml:space="preserve">        d.findElement(By.id("username")).sendKeys("tomsmith");</w:t>
+              <w:br/>
+              <w:t xml:space="preserve">        d.findElement(By.id("password")).sendKeys("SuperSecretPassword!");</w:t>
+              <w:br/>
+              <w:t xml:space="preserve">        d.findElement(By.cssSelector("button[type='submit']")).click();</w:t>
+              <w:br/>
+              <w:t xml:space="preserve">        Assert.assertTrue(d.getCurrentUrl().contains("/secure"));</w:t>
+              <w:br/>
+              <w:t xml:space="preserve">    }</w:t>
+              <w:br/>
+              <w:br/>
+              <w:t xml:space="preserve">    @Test(priority = 3, groups = {"regression"})</w:t>
+              <w:br/>
+              <w:t xml:space="preserve">    public void logoutTest() {</w:t>
+              <w:br/>
+              <w:t xml:space="preserve">        d.findElement(By.cssSelector("a[href='/logout']")).click();</w:t>
+              <w:br/>
+              <w:t xml:space="preserve">        Assert.assertTrue(d.getCurrentUrl().contains("/login"));</w:t>
+              <w:br/>
+              <w:t xml:space="preserve">    }</w:t>
+              <w:br/>
+              <w:br/>
+              <w:t xml:space="preserve">    @AfterClass(alwaysRun = true)</w:t>
+              <w:br/>
+              <w:t xml:space="preserve">    public void tearDown() { d.quit(); }</w:t>
+              <w:br/>
+              <w:t>}</w:t>
+            </w:r>
+          </w:p>
+        </w:tc>
+      </w:tr>
+    </w:tbl>
+    <w:p/>
+    <w:p>
+      <w:pPr>
+        <w:spacing w:after="40"/>
+      </w:pPr>
+      <w:r>
+        <w:rPr>
+          <w:b/>
+          <w:color w:val="1F4E79"/>
+        </w:rPr>
+        <w:t>Step 2: Create testng.xml in the project root (right-click Project &gt; New &gt; File &gt; testng.xml):</w:t>
+      </w:r>
+    </w:p>
+    <w:tbl>
+      <w:tblPr>
+        <w:tblStyle w:val="TableGrid"/>
+        <w:tblW w:type="auto" w:w="0"/>
+        <w:tblLook w:firstColumn="1" w:firstRow="1" w:lastColumn="0" w:lastRow="0" w:noHBand="0" w:noVBand="1" w:val="04A0"/>
+      </w:tblPr>
+      <w:tblGrid>
+        <w:gridCol w:w="10200"/>
+      </w:tblGrid>
+      <w:tr>
+        <w:tc>
+          <w:tcPr>
+            <w:tcW w:type="dxa" w:w="10200"/>
+            <w:shd w:fill="F2F2F2"/>
+          </w:tcPr>
+          <w:p>
+            <w:pPr>
+              <w:spacing w:after="0"/>
+            </w:pPr>
+            <w:r>
+              <w:rPr>
+                <w:rFonts w:ascii="Consolas" w:hAnsi="Consolas" w:eastAsia="Consolas"/>
+                <w:sz w:val="18"/>
+              </w:rPr>
+              <w:t>&lt;?xml version="1.0" encoding="UTF-8"?&gt;</w:t>
+              <w:br/>
+              <w:t>&lt;!DOCTYPE suite SYSTEM "https://testng.org/testng-1.0.dtd"&gt;</w:t>
+              <w:br/>
+              <w:t>&lt;suite name="STQA Suite"&gt;</w:t>
+              <w:br/>
+              <w:t xml:space="preserve">  &lt;test name="Smoke Tests"&gt;</w:t>
+              <w:br/>
+              <w:t xml:space="preserve">    &lt;groups&gt;</w:t>
+              <w:br/>
+              <w:t xml:space="preserve">      &lt;run&gt;&lt;include name="smoke"/&gt;&lt;/run&gt;</w:t>
+              <w:br/>
+              <w:t xml:space="preserve">    &lt;/groups&gt;</w:t>
+              <w:br/>
+              <w:t xml:space="preserve">    &lt;classes&gt;</w:t>
+              <w:br/>
+              <w:t xml:space="preserve">      &lt;class name="p13.TestNGDemo"/&gt;</w:t>
+              <w:br/>
+              <w:t xml:space="preserve">    &lt;/classes&gt;</w:t>
+              <w:br/>
+              <w:t xml:space="preserve">  &lt;/test&gt;</w:t>
+              <w:br/>
+              <w:t>&lt;/suite&gt;</w:t>
+            </w:r>
+          </w:p>
+        </w:tc>
+      </w:tr>
+    </w:tbl>
+    <w:p/>
+    <w:p>
+      <w:pPr>
+        <w:spacing w:after="40"/>
+      </w:pPr>
+      <w:r>
+        <w:rPr>
+          <w:b/>
+          <w:color w:val="1F4E79"/>
+        </w:rPr>
+        <w:t>Step 3: Run:</w:t>
+      </w:r>
+      <w:r>
+        <w:t xml:space="preserve"> Right-click testng.xml &gt; Run As &gt; TestNG Suite. Only the smoke group runs, in priority order.</w:t>
+      </w:r>
+    </w:p>
+    <w:p>
+      <w:pPr>
+        <w:spacing w:after="40"/>
+      </w:pPr>
+      <w:r>
+        <w:rPr>
+          <w:b/>
+          <w:color w:val="1F4E79"/>
+        </w:rPr>
+        <w:t>Expected Output:</w:t>
+      </w:r>
+    </w:p>
+    <w:tbl>
+      <w:tblPr>
+        <w:tblStyle w:val="TableGrid"/>
+        <w:tblW w:type="auto" w:w="0"/>
+        <w:tblLook w:firstColumn="1" w:firstRow="1" w:lastColumn="0" w:lastRow="0" w:noHBand="0" w:noVBand="1" w:val="04A0"/>
+      </w:tblPr>
+      <w:tblGrid>
+        <w:gridCol w:w="10200"/>
+      </w:tblGrid>
+      <w:tr>
+        <w:tc>
+          <w:tcPr>
+            <w:tcW w:type="dxa" w:w="10200"/>
+            <w:shd w:fill="F2F2F2"/>
+          </w:tcPr>
+          <w:p>
+            <w:pPr>
+              <w:spacing w:after="0"/>
+            </w:pPr>
+            <w:r>
+              <w:rPr>
+                <w:rFonts w:ascii="Consolas" w:hAnsi="Consolas" w:eastAsia="Consolas"/>
+                <w:sz w:val="18"/>
+              </w:rPr>
+              <w:t>PASSED: openLoginPage</w:t>
+              <w:br/>
+              <w:t>PASSED: validLogin</w:t>
+              <w:br/>
+              <w:t>STQA Suite - Total tests run: 2, Passes: 2, Failures: 0, Skips: 0</w:t>
+            </w:r>
+          </w:p>
+        </w:tc>
+      </w:tr>
+    </w:tbl>
+    <w:p/>
+    <w:p>
+      <w:pPr>
+        <w:spacing w:after="40"/>
+      </w:pPr>
+      <w:r>
+        <w:rPr>
+          <w:b/>
+          <w:color w:val="1F4E79"/>
+        </w:rPr>
+        <w:t>Step 4: HTML Report:</w:t>
+      </w:r>
+      <w:r>
+        <w:t xml:space="preserve"> Press F5 on the project &gt; open test-output &gt; index.html (or emailable-report.html) in a browser. It shows each test, its group, the time taken and PASS/FAIL.</w:t>
+      </w:r>
+    </w:p>
+    <w:p>
+      <w:pPr>
+        <w:spacing w:after="40"/>
+      </w:pPr>
+      <w:r>
+        <w:rPr>
+          <w:b/>
+          <w:color w:val="1F4E79"/>
+        </w:rPr>
+        <w:t>Note:</w:t>
+      </w:r>
+      <w:r>
+        <w:t xml:space="preserve"> alwaysRun = true on @BeforeClass/@AfterClass is required. Without it, group filtering skips setUp() and every test fails with a NullPointerException (driver is null). To run all 3 tests, right-click TestNGDemo.java &gt; Run As &gt; TestNG Test.</w:t>
+      </w:r>
+    </w:p>
+    <w:p>
+      <w:r>
+        <w:br w:type="page"/>
+      </w:r>
+    </w:p>
+    <w:p>
+      <w:pPr>
+        <w:pStyle w:val="Heading1"/>
+      </w:pPr>
+      <w:r>
+        <w:t>Practical 14: Jenkins CI for Selenium Tests</w:t>
+      </w:r>
+    </w:p>
+    <w:p>
+      <w:pPr>
+        <w:spacing w:after="40"/>
+      </w:pPr>
+      <w:r>
+        <w:rPr>
+          <w:b/>
+          <w:color w:val="1F4E79"/>
+        </w:rPr>
+        <w:t>Aim:</w:t>
+      </w:r>
+      <w:r>
+        <w:t xml:space="preserve"> Configure Jenkins to run Selenium scripts automatically. Generate build reports and analyse test execution history.</w:t>
+      </w:r>
+    </w:p>
+    <w:p>
+      <w:pPr>
+        <w:spacing w:after="40"/>
+      </w:pPr>
+      <w:r>
+        <w:rPr>
+          <w:b/>
+          <w:color w:val="1F4E79"/>
+        </w:rPr>
+        <w:t>Requirements:</w:t>
+      </w:r>
+      <w:r>
+        <w:t xml:space="preserve"> JDK 17+, jenkins.war from https://www.jenkins.io/download/, the Practical 13 project (TestNGDemo + testng.xml).</w:t>
+      </w:r>
+    </w:p>
+    <w:p>
+      <w:pPr>
+        <w:spacing w:after="40"/>
+      </w:pPr>
+      <w:r>
+        <w:rPr>
+          <w:b/>
+          <w:color w:val="1F4E79"/>
+        </w:rPr>
+        <w:t>Step 0: Put all JARs in one folder</w:t>
+      </w:r>
+    </w:p>
+    <w:p>
+      <w:r>
+        <w:t>Copy all Selenium JARs (with the lib folder JARs) and the TestNG JARs (testng, jcommander, slf4j-api) into C:\STQA\jars. Run Practical 13 once in Eclipse, so the compiled classes are in the project's bin folder.</w:t>
+      </w:r>
+    </w:p>
+    <w:p>
+      <w:pPr>
+        <w:spacing w:after="40"/>
+      </w:pPr>
+      <w:r>
+        <w:rPr>
+          <w:b/>
+          <w:color w:val="1F4E79"/>
+        </w:rPr>
+        <w:t>Step 1: Start Jenkins (Command Prompt, in the folder with jenkins.war):</w:t>
+      </w:r>
+    </w:p>
+    <w:tbl>
+      <w:tblPr>
+        <w:tblStyle w:val="TableGrid"/>
+        <w:tblW w:type="auto" w:w="0"/>
+        <w:tblLook w:firstColumn="1" w:firstRow="1" w:lastColumn="0" w:lastRow="0" w:noHBand="0" w:noVBand="1" w:val="04A0"/>
+      </w:tblPr>
+      <w:tblGrid>
+        <w:gridCol w:w="10200"/>
+      </w:tblGrid>
+      <w:tr>
+        <w:tc>
+          <w:tcPr>
+            <w:tcW w:type="dxa" w:w="10200"/>
+            <w:shd w:fill="F2F2F2"/>
+          </w:tcPr>
+          <w:p>
+            <w:pPr>
+              <w:spacing w:after="0"/>
+            </w:pPr>
+            <w:r>
+              <w:rPr>
+                <w:rFonts w:ascii="Consolas" w:hAnsi="Consolas" w:eastAsia="Consolas"/>
+                <w:sz w:val="18"/>
+              </w:rPr>
+              <w:t>java -jar jenkins.war --httpPort=8080</w:t>
+            </w:r>
+          </w:p>
+        </w:tc>
+      </w:tr>
+    </w:tbl>
+    <w:p/>
+    <w:p>
+      <w:r>
+        <w:t>Keep this window open. Copy the admin password printed in the console (it is also saved in C:\Users\&lt;you&gt;\.jenkins\secrets\initialAdminPassword).</w:t>
+      </w:r>
+    </w:p>
+    <w:p>
+      <w:pPr>
+        <w:spacing w:after="40"/>
+      </w:pPr>
+      <w:r>
+        <w:rPr>
+          <w:b/>
+          <w:color w:val="1F4E79"/>
+        </w:rPr>
+        <w:t>Step 2: Set up Jenkins</w:t>
+      </w:r>
+    </w:p>
+    <w:p>
+      <w:pPr>
+        <w:pStyle w:val="ListNumber"/>
+      </w:pPr>
+      <w:r>
+        <w:t>Open http://localhost:8080 &gt; paste the password &gt; Continue &gt; Install suggested plugins.</w:t>
+      </w:r>
+    </w:p>
+    <w:p>
+      <w:pPr>
+        <w:pStyle w:val="ListNumber"/>
+      </w:pPr>
+      <w:r>
+        <w:t>Create the admin user &gt; Save and Continue &gt; Save and Finish &gt; Start using Jenkins.</w:t>
+      </w:r>
+    </w:p>
+    <w:p>
+      <w:pPr>
+        <w:spacing w:after="40"/>
+      </w:pPr>
+      <w:r>
+        <w:rPr>
+          <w:b/>
+          <w:color w:val="1F4E79"/>
+        </w:rPr>
+        <w:t>Step 3: Create the job</w:t>
+      </w:r>
+    </w:p>
+    <w:p>
+      <w:pPr>
+        <w:pStyle w:val="ListNumber"/>
+      </w:pPr>
+      <w:r>
+        <w:t>Dashboard &gt; New Item &gt; name: STQA_Selenium_CI &gt; Freestyle project &gt; OK.</w:t>
+      </w:r>
+    </w:p>
+    <w:p>
+      <w:pPr>
+        <w:pStyle w:val="ListNumber"/>
+      </w:pPr>
+      <w:r>
+        <w:t>Source Code Management: None.</w:t>
+      </w:r>
+    </w:p>
+    <w:p>
+      <w:pPr>
+        <w:pStyle w:val="ListNumber"/>
+      </w:pPr>
+      <w:r>
+        <w:t>Triggers: tick Build periodically &gt; Schedule: H/30 * * * *  (runs every 30 minutes).</w:t>
+      </w:r>
+    </w:p>
+    <w:p>
+      <w:pPr>
+        <w:pStyle w:val="ListNumber"/>
+      </w:pPr>
+      <w:r>
+        <w:t>Build Steps &gt; Add build step &gt; Execute Windows batch command, and paste the commands below. Change the project path to your own.</w:t>
+      </w:r>
+    </w:p>
+    <w:tbl>
+      <w:tblPr>
+        <w:tblStyle w:val="TableGrid"/>
+        <w:tblW w:type="auto" w:w="0"/>
+        <w:tblLook w:firstColumn="1" w:firstRow="1" w:lastColumn="0" w:lastRow="0" w:noHBand="0" w:noVBand="1" w:val="04A0"/>
+      </w:tblPr>
+      <w:tblGrid>
+        <w:gridCol w:w="10200"/>
+      </w:tblGrid>
+      <w:tr>
+        <w:tc>
+          <w:tcPr>
+            <w:tcW w:type="dxa" w:w="10200"/>
+            <w:shd w:fill="F2F2F2"/>
+          </w:tcPr>
+          <w:p>
+            <w:pPr>
+              <w:spacing w:after="0"/>
+            </w:pPr>
+            <w:r>
+              <w:rPr>
+                <w:rFonts w:ascii="Consolas" w:hAnsi="Consolas" w:eastAsia="Consolas"/>
+                <w:sz w:val="18"/>
+              </w:rPr>
+              <w:t>cd /d C:\Users\&lt;you&gt;\eclipse-workspace\STQA</w:t>
+              <w:br/>
+              <w:t>java -cp "bin;C:\STQA\jars\*" org.testng.TestNG testng.xml</w:t>
+              <w:br/>
+              <w:t>xcopy /y /i test-output\testng-results.xml "%WORKSPACE%\test-output\"</w:t>
+            </w:r>
+          </w:p>
+        </w:tc>
+      </w:tr>
+    </w:tbl>
+    <w:p/>
+    <w:p>
+      <w:r>
+        <w:t>The xcopy line copies the results into Jenkins' workspace so the TestNG report plugin can find them. Click Save.</w:t>
+      </w:r>
+    </w:p>
+    <w:p>
+      <w:pPr>
+        <w:spacing w:after="40"/>
+      </w:pPr>
+      <w:r>
+        <w:rPr>
+          <w:b/>
+          <w:color w:val="1F4E79"/>
+        </w:rPr>
+        <w:t>Step 4: Build</w:t>
+      </w:r>
+    </w:p>
+    <w:p>
+      <w:r>
+        <w:t>Click Build Now &gt; click build #1 &gt; Console Output.</w:t>
+      </w:r>
+    </w:p>
+    <w:tbl>
+      <w:tblPr>
+        <w:tblStyle w:val="TableGrid"/>
+        <w:tblW w:type="auto" w:w="0"/>
+        <w:tblLook w:firstColumn="1" w:firstRow="1" w:lastColumn="0" w:lastRow="0" w:noHBand="0" w:noVBand="1" w:val="04A0"/>
+      </w:tblPr>
+      <w:tblGrid>
+        <w:gridCol w:w="10200"/>
+      </w:tblGrid>
+      <w:tr>
+        <w:tc>
+          <w:tcPr>
+            <w:tcW w:type="dxa" w:w="10200"/>
+            <w:shd w:fill="F2F2F2"/>
+          </w:tcPr>
+          <w:p>
+            <w:pPr>
+              <w:spacing w:after="0"/>
+            </w:pPr>
+            <w:r>
+              <w:rPr>
+                <w:rFonts w:ascii="Consolas" w:hAnsi="Consolas" w:eastAsia="Consolas"/>
+                <w:sz w:val="18"/>
+              </w:rPr>
+              <w:t>STQA Suite</w:t>
+              <w:br/>
+              <w:t>Total tests run: 2, Passes: 2, Failures: 0, Skips: 0</w:t>
+              <w:br/>
+              <w:t>Finished: SUCCESS</w:t>
+            </w:r>
+          </w:p>
+        </w:tc>
+      </w:tr>
+    </w:tbl>
+    <w:p/>
+    <w:p>
+      <w:pPr>
+        <w:spacing w:after="40"/>
+      </w:pPr>
+      <w:r>
+        <w:rPr>
+          <w:b/>
+          <w:color w:val="1F4E79"/>
+        </w:rPr>
+        <w:t>Step 5: TestNG report in Jenkins</w:t>
+      </w:r>
+    </w:p>
+    <w:p>
+      <w:pPr>
+        <w:pStyle w:val="ListNumber"/>
+      </w:pPr>
+      <w:r>
+        <w:t>Manage Jenkins &gt; Plugins &gt; Available plugins &gt; search "TestNG Results" &gt; Install.</w:t>
+      </w:r>
+    </w:p>
+    <w:p>
+      <w:pPr>
+        <w:pStyle w:val="ListNumber"/>
+      </w:pPr>
+      <w:r>
+        <w:t>Job &gt; Configure &gt; Add post-build action &gt; Publish TestNG Results &gt; keep **/testng-results.xml &gt; Save.</w:t>
+      </w:r>
+    </w:p>
+    <w:p>
+      <w:pPr>
+        <w:pStyle w:val="ListNumber"/>
+      </w:pPr>
+      <w:r>
+        <w:t>Build Now again. Open the job &gt; TestNG Results to see pass/fail counts and time.</w:t>
+      </w:r>
+    </w:p>
+    <w:p>
+      <w:pPr>
+        <w:spacing w:after="40"/>
+      </w:pPr>
+      <w:r>
+        <w:rPr>
+          <w:b/>
+          <w:color w:val="1F4E79"/>
+        </w:rPr>
+        <w:t>Step 6: Execution history (trend)</w:t>
+      </w:r>
+    </w:p>
+    <w:p>
+      <w:pPr>
+        <w:pStyle w:val="ListNumber"/>
+      </w:pPr>
+      <w:r>
+        <w:t>Build 2 or 3 more times.</w:t>
+      </w:r>
+    </w:p>
+    <w:p>
+      <w:pPr>
+        <w:pStyle w:val="ListNumber"/>
+      </w:pPr>
+      <w:r>
+        <w:t>Break one assertion in TestNGDemo.java on purpose, e.g. Assert.assertEquals(d.getTitle(), "WRONG"). Save it so Eclipse recompiles. Build Now: the build is marked UNSTABLE (yellow).</w:t>
+      </w:r>
+    </w:p>
+    <w:p>
+      <w:pPr>
+        <w:pStyle w:val="ListNumber"/>
+      </w:pPr>
+      <w:r>
+        <w:t>Fix the assertion, save, Build Now: back to SUCCESS (green).</w:t>
+      </w:r>
+    </w:p>
+    <w:p>
+      <w:pPr>
+        <w:pStyle w:val="ListNumber"/>
+      </w:pPr>
+      <w:r>
+        <w:t>The job page shows the Build History (e.g. #1-#3 Success, #4 Unstable, #5 Success) and the TestNG Results Trend graph.</w:t>
       </w:r>
     </w:p>
     <w:p>

</xml_diff>